<commit_message>
Add resource loading with technical skills; align docs to RN/.NET/PostgreSQL stack
WBS & Integrated Project Plan, Section 13 rewritten:
- stack-to-skills mapping for React Native, .NET and PostgreSQL
- team composition with seniority, peak FTE, person-months, skills and tools
- monthly FTE loading (Oct 2026 - Jun 2027, 154 person-months) with histogram
- squad composition at peak, resource-to-WBS assignment matrix,
  SportSeek-provided resources, onboarding/continuity/roll-off
Workbook gains a Resource loading sheet. Technical Approach now reflects
the confirmed stack (stack table, OpenIddict leaning for ADR-01, React/Next.js
for ADR-05); Delivery Model squads name stack roles.

Co-Authored-By: Claude Opus 5.5 <noreply@anthropic.com>
Claude-Session: https://claude.ai/code/session_01J895FnYXrgPC57efM14tYQ
</commit_message>
<xml_diff>
--- a/docs/phase-2a/02_Project_Delivery_Model.docx
+++ b/docs/phase-2a/02_Project_Delivery_Model.docx
@@ -9787,7 +9787,7 @@
                 <w:sz w:val="18"/>
                 <w:szCs w:val="18"/>
               </w:rPr>
-              <w:t xml:space="preserve">Embedded developer(s)</w:t>
+              <w:t xml:space="preserve">Embedded .NET developer</w:t>
             </w:r>
           </w:p>
         </w:tc>
@@ -9819,7 +9819,7 @@
                 <w:sz w:val="18"/>
                 <w:szCs w:val="18"/>
               </w:rPr>
-              <w:t xml:space="preserve">Tech lead, backend engineers, mobile engineer, QA</w:t>
+              <w:t xml:space="preserve">.NET tech lead, .NET backend engineer, React Native engineer, QA</w:t>
             </w:r>
           </w:p>
         </w:tc>
@@ -9890,7 +9890,7 @@
                 <w:sz w:val="18"/>
                 <w:szCs w:val="18"/>
               </w:rPr>
-              <w:t xml:space="preserve">Embedded developer(s)</w:t>
+              <w:t xml:space="preserve">Embedded .NET or React Native developer</w:t>
             </w:r>
           </w:p>
         </w:tc>
@@ -9923,7 +9923,7 @@
                 <w:sz w:val="18"/>
                 <w:szCs w:val="18"/>
               </w:rPr>
-              <w:t xml:space="preserve">Tech lead, backend engineers, mobile engineers, QA</w:t>
+              <w:t xml:space="preserve">.NET tech lead, .NET backend engineer, React Native lead and engineer, QA</w:t>
             </w:r>
           </w:p>
         </w:tc>
@@ -9992,7 +9992,7 @@
                 <w:sz w:val="18"/>
                 <w:szCs w:val="18"/>
               </w:rPr>
-              <w:t xml:space="preserve">Embedded developer(s)</w:t>
+              <w:t xml:space="preserve">Embedded .NET developer</w:t>
             </w:r>
           </w:p>
         </w:tc>
@@ -10024,7 +10024,7 @@
                 <w:sz w:val="18"/>
                 <w:szCs w:val="18"/>
               </w:rPr>
-              <w:t xml:space="preserve">Backend engineers, front-end engineer, QA</w:t>
+              <w:t xml:space="preserve">.NET backend engineers, QA</w:t>
             </w:r>
           </w:p>
         </w:tc>
@@ -10095,7 +10095,7 @@
                 <w:sz w:val="18"/>
                 <w:szCs w:val="18"/>
               </w:rPr>
-              <w:t xml:space="preserve">Embedded developer(s)</w:t>
+              <w:t xml:space="preserve">Embedded React developer</w:t>
             </w:r>
           </w:p>
         </w:tc>
@@ -10128,7 +10128,7 @@
                 <w:sz w:val="18"/>
                 <w:szCs w:val="18"/>
               </w:rPr>
-              <w:t xml:space="preserve">Front-end lead, front-end engineers, QA</w:t>
+              <w:t xml:space="preserve">React/Next.js front-end lead and engineers</w:t>
             </w:r>
           </w:p>
         </w:tc>
@@ -10229,7 +10229,7 @@
                 <w:sz w:val="18"/>
                 <w:szCs w:val="18"/>
               </w:rPr>
-              <w:t xml:space="preserve">DevOps/SRE, security tester (VAPT), performance tester, business analysts, UI designers</w:t>
+              <w:t xml:space="preserve">PostgreSQL database engineer, QA lead, DevOps/SRE, security tester (VAPT), performance tester, business analysts, UI designers, Scrum Master</w:t>
             </w:r>
           </w:p>
         </w:tc>
@@ -10249,7 +10249,7 @@
           <w:rFonts w:ascii="Arial" w:cs="Arial" w:eastAsia="Arial" w:hAnsi="Arial"/>
           <w:color w:val="1A1A1A"/>
         </w:rPr>
-        <w:t xml:space="preserve">Indicative Srivin headcount by period is in the WBS &amp; Integrated Project Plan, Section 13. The final composition and rate card will be in the commercial proposal, as the SOW Next Steps require.</w:t>
+        <w:t xml:space="preserve">The technology stack is React Native (mobile), .NET (back end) and PostgreSQL (database), with React/Next.js proposed for the new web application. Month-by-month resource loading, the skills required for each role and the resource-to-WBS assignment matrix are in the WBS &amp; Integrated Project Plan, Section 13. The final composition and rate card will be in the commercial proposal, as the SOW Next Steps require.</w:t>
       </w:r>
     </w:p>
     <w:p>

</xml_diff>

<commit_message>
Move F3 Shared Identity into R1 public launch (v2.1)
At SportSeek's request, Shared Identity now ships with the 20 Oct 2026
launch:
- R1: hardened launch + F3 (identity service, OTP-verified account
  linking, multi-role, KYC status, 1:1 bootstrap of existing accounts),
  behind a remote switch with fallback to Phase 1 login; targeted
  identity pen test; new dependency D22 (identity decisions by 2 Oct)
- R2: F1 Email, F2 Reminders, F4 Push & preferences, plus merge of
  existing duplicate accounts (D18 moved to 30 Oct)
- October capacity +1 .NET, +1 React Native, extra security testing
  (69.5 person-months total); ADR-01 decided by 2 Oct
- figures, dependencies, risks, milestones and all three documents updated

Co-Authored-By: Claude Opus 5.5 <noreply@anthropic.com>
Claude-Session: https://claude.ai/code/session_01J895FnYXrgPC57efM14tYQ
</commit_message>
<xml_diff>
--- a/docs/phase-2a/02_Project_Delivery_Model.docx
+++ b/docs/phase-2a/02_Project_Delivery_Model.docx
@@ -83,7 +83,7 @@
           <w:sz w:val="26"/>
           <w:szCs w:val="26"/>
         </w:rPr>
-        <w:t xml:space="preserve">How Srivin Platforms delivers SportSeek Phase 2A with an AI-native pod: public launch on 20 October 2026, then two features in production every month</w:t>
+        <w:t xml:space="preserve">How Srivin Platforms delivers SportSeek Phase 2A with an AI-native pod: public launch on 20 October 2026, then an average of two features in production every month</w:t>
       </w:r>
     </w:p>
     <w:tbl>
@@ -531,7 +531,7 @@
                 <w:sz w:val="18"/>
                 <w:szCs w:val="18"/>
               </w:rPr>
-              <w:t xml:space="preserve">v2.0 (AI-native release train) — 27 September 2026</w:t>
+              <w:t xml:space="preserve">v2.1 (AI-native release train; Shared Identity in R1) — 27 September 2026</w:t>
             </w:r>
           </w:p>
         </w:tc>
@@ -606,7 +606,7 @@
                 <w:sz w:val="18"/>
                 <w:szCs w:val="18"/>
               </w:rPr>
-              <w:t xml:space="preserve">Issued for client review — supersedes v1.0</w:t>
+              <w:t xml:space="preserve">Issued for client review — supersedes v2.0</w:t>
             </w:r>
           </w:p>
         </w:tc>
@@ -1506,16 +1506,16 @@
                 <w:sz w:val="18"/>
                 <w:szCs w:val="18"/>
               </w:rPr>
-              <w:t xml:space="preserve">A release every month, two features each</w:t>
-            </w:r>
-            <w:r>
-              <w:rPr>
-                <w:rFonts w:ascii="Arial" w:cs="Arial" w:eastAsia="Arial" w:hAnsi="Arial"/>
-                <w:color w:val="1A1A1A"/>
-                <w:sz w:val="18"/>
-                <w:szCs w:val="18"/>
-              </w:rPr>
-              <w:t xml:space="preserve">, from 20 Oct 2026</w:t>
+              <w:t xml:space="preserve">A release every month, averaging two features each</w:t>
+            </w:r>
+            <w:r>
+              <w:rPr>
+                <w:rFonts w:ascii="Arial" w:cs="Arial" w:eastAsia="Arial" w:hAnsi="Arial"/>
+                <w:color w:val="1A1A1A"/>
+                <w:sz w:val="18"/>
+                <w:szCs w:val="18"/>
+              </w:rPr>
+              <w:t xml:space="preserve">, from 20 Oct 2026; Shared Identity live at launch</w:t>
             </w:r>
           </w:p>
         </w:tc>
@@ -2350,7 +2350,7 @@
       <w:r>
         <w:drawing>
           <wp:inline distT="0" distB="0" distL="0" distR="0">
-            <wp:extent cx="6096000" cy="2143125"/>
+            <wp:extent cx="6096000" cy="1971675"/>
             <wp:effectExtent t="0" r="0" b="0" l="0"/>
             <wp:docPr id="1" name="fig" descr="Figure 1 — Six monthly releases, twelve features" title="Figure 1 — Six monthly releases, twelve features"/>
             <wp:cNvGraphicFramePr>
@@ -2375,7 +2375,7 @@
                   <pic:spPr bwMode="auto">
                     <a:xfrm>
                       <a:off x="0" y="0"/>
-                      <a:ext cx="6096000" cy="2143125"/>
+                      <a:ext cx="6096000" cy="1971675"/>
                     </a:xfrm>
                     <a:prstGeom prst="rect">
                       <a:avLst/>
@@ -4361,7 +4361,7 @@
           <w:rFonts w:ascii="Arial" w:cs="Arial" w:eastAsia="Arial" w:hAnsi="Arial"/>
           <w:color w:val="1A1A1A"/>
         </w:rPr>
-        <w:t xml:space="preserve">R1 takes SportSeek public on a hardened, security-tested and monitored Phase 1 product, with </w:t>
+        <w:t xml:space="preserve">R1 takes SportSeek public on a hardened, security-tested and monitored Phase 1 product with </w:t>
       </w:r>
       <w:r>
         <w:rPr>
@@ -4370,30 +4370,14 @@
           <w:bCs/>
           <w:color w:val="1A1A1A"/>
         </w:rPr>
-        <w:t xml:space="preserve">F1 Email notifications</w:t>
+        <w:t xml:space="preserve">F3 Shared Identity</w:t>
       </w:r>
       <w:r>
         <w:rPr>
           <w:rFonts w:ascii="Arial" w:cs="Arial" w:eastAsia="Arial" w:hAnsi="Arial"/>
           <w:color w:val="1A1A1A"/>
         </w:rPr>
-        <w:t xml:space="preserve"> and </w:t>
-      </w:r>
-      <w:r>
-        <w:rPr>
-          <w:rFonts w:ascii="Arial" w:cs="Arial" w:eastAsia="Arial" w:hAnsi="Arial"/>
-          <w:b/>
-          <w:bCs/>
-          <w:color w:val="1A1A1A"/>
-        </w:rPr>
-        <w:t xml:space="preserve">F2 Booking &amp; event reminders</w:t>
-      </w:r>
-      <w:r>
-        <w:rPr>
-          <w:rFonts w:ascii="Arial" w:cs="Arial" w:eastAsia="Arial" w:hAnsi="Arial"/>
-          <w:color w:val="1A1A1A"/>
-        </w:rPr>
-        <w:t xml:space="preserve"> on day one.</w:t>
+        <w:t xml:space="preserve"> live on day one: one account across the User and Partner apps, OTP-verified account linking and multiple roles on one identity. Because identity touches every login, R1 adds extra identity capacity for October, an identity pen test, and a remote switch that can fall back to the Phase 1 login.</w:t>
       </w:r>
     </w:p>
     <w:tbl>
@@ -4958,7 +4942,7 @@
                 <w:sz w:val="18"/>
                 <w:szCs w:val="18"/>
               </w:rPr>
-              <w:t xml:space="preserve">Frozen scope incl. F1/F2; go-live criteria</w:t>
+              <w:t xml:space="preserve">Frozen scope incl. F3 scope and fallback; go-live criteria</w:t>
             </w:r>
           </w:p>
         </w:tc>
@@ -4996,7 +4980,7 @@
                 <w:sz w:val="18"/>
                 <w:szCs w:val="18"/>
               </w:rPr>
-              <w:t xml:space="preserve">14 Oct</w:t>
+              <w:t xml:space="preserve">02 Oct</w:t>
             </w:r>
           </w:p>
         </w:tc>
@@ -5029,7 +5013,7 @@
                 <w:sz w:val="18"/>
                 <w:szCs w:val="18"/>
               </w:rPr>
-              <w:t xml:space="preserve">Code freeze</w:t>
+              <w:t xml:space="preserve">Identity decisions (D22)</w:t>
             </w:r>
           </w:p>
         </w:tc>
@@ -5062,7 +5046,7 @@
                 <w:sz w:val="18"/>
                 <w:szCs w:val="18"/>
               </w:rPr>
-              <w:t xml:space="preserve">Launch pod</w:t>
+              <w:t xml:space="preserve">SportSeek PO; Srivin architect</w:t>
             </w:r>
           </w:p>
         </w:tc>
@@ -5095,7 +5079,7 @@
                 <w:sz w:val="18"/>
                 <w:szCs w:val="18"/>
               </w:rPr>
-              <w:t xml:space="preserve">Release candidate; store submissions</w:t>
+              <w:t xml:space="preserve">Linking identifiers, roles, KYC fields, user messaging</w:t>
             </w:r>
           </w:p>
         </w:tc>
@@ -5132,7 +5116,7 @@
                 <w:sz w:val="18"/>
                 <w:szCs w:val="18"/>
               </w:rPr>
-              <w:t xml:space="preserve">19 Oct</w:t>
+              <w:t xml:space="preserve">14 Oct</w:t>
             </w:r>
           </w:p>
         </w:tc>
@@ -5164,7 +5148,7 @@
                 <w:sz w:val="18"/>
                 <w:szCs w:val="18"/>
               </w:rPr>
-              <w:t xml:space="preserve">Go/No-Go</w:t>
+              <w:t xml:space="preserve">Code freeze</w:t>
             </w:r>
           </w:p>
         </w:tc>
@@ -5196,7 +5180,7 @@
                 <w:sz w:val="18"/>
                 <w:szCs w:val="18"/>
               </w:rPr>
-              <w:t xml:space="preserve">SportSeek sponsor (decides), PO, Srivin lead</w:t>
+              <w:t xml:space="preserve">Launch pod</w:t>
             </w:r>
           </w:p>
         </w:tc>
@@ -5228,7 +5212,7 @@
                 <w:sz w:val="18"/>
                 <w:szCs w:val="18"/>
               </w:rPr>
-              <w:t xml:space="preserve">Signed Go/No-Go record</w:t>
+              <w:t xml:space="preserve">Release candidate; store submissions</w:t>
             </w:r>
           </w:p>
         </w:tc>
@@ -5266,6 +5250,142 @@
                 <w:sz w:val="18"/>
                 <w:szCs w:val="18"/>
               </w:rPr>
+              <w:t xml:space="preserve">19 Oct</w:t>
+            </w:r>
+          </w:p>
+        </w:tc>
+        <w:tc>
+          <w:tcPr>
+            <w:tcW w:type="dxa" w:w="3212"/>
+            <w:tcBorders>
+              <w:top w:val="single" w:color="C9CED8" w:sz="4"/>
+              <w:left w:val="single" w:color="C9CED8" w:sz="4"/>
+              <w:bottom w:val="single" w:color="C9CED8" w:sz="4"/>
+              <w:right w:val="single" w:color="C9CED8" w:sz="4"/>
+            </w:tcBorders>
+            <w:shd w:fill="F3F5F9" w:color="auto" w:val="clear"/>
+            <w:tcMar>
+              <w:top w:type="dxa" w:w="60"/>
+              <w:left w:type="dxa" w:w="90"/>
+              <w:bottom w:type="dxa" w:w="60"/>
+              <w:right w:type="dxa" w:w="90"/>
+            </w:tcMar>
+            <w:vAlign w:val="top"/>
+          </w:tcPr>
+          <w:p>
+            <w:pPr>
+              <w:spacing w:after="20" w:line="250"/>
+            </w:pPr>
+            <w:r>
+              <w:rPr>
+                <w:rFonts w:ascii="Arial" w:cs="Arial" w:eastAsia="Arial" w:hAnsi="Arial"/>
+                <w:color w:val="1A1A1A"/>
+                <w:sz w:val="18"/>
+                <w:szCs w:val="18"/>
+              </w:rPr>
+              <w:t xml:space="preserve">Go/No-Go (launch; F3 on/off)</w:t>
+            </w:r>
+          </w:p>
+        </w:tc>
+        <w:tc>
+          <w:tcPr>
+            <w:tcW w:type="dxa" w:w="2677"/>
+            <w:tcBorders>
+              <w:top w:val="single" w:color="C9CED8" w:sz="4"/>
+              <w:left w:val="single" w:color="C9CED8" w:sz="4"/>
+              <w:bottom w:val="single" w:color="C9CED8" w:sz="4"/>
+              <w:right w:val="single" w:color="C9CED8" w:sz="4"/>
+            </w:tcBorders>
+            <w:shd w:fill="F3F5F9" w:color="auto" w:val="clear"/>
+            <w:tcMar>
+              <w:top w:type="dxa" w:w="60"/>
+              <w:left w:type="dxa" w:w="90"/>
+              <w:bottom w:type="dxa" w:w="60"/>
+              <w:right w:type="dxa" w:w="90"/>
+            </w:tcMar>
+            <w:vAlign w:val="top"/>
+          </w:tcPr>
+          <w:p>
+            <w:pPr>
+              <w:spacing w:after="20" w:line="250"/>
+            </w:pPr>
+            <w:r>
+              <w:rPr>
+                <w:rFonts w:ascii="Arial" w:cs="Arial" w:eastAsia="Arial" w:hAnsi="Arial"/>
+                <w:color w:val="1A1A1A"/>
+                <w:sz w:val="18"/>
+                <w:szCs w:val="18"/>
+              </w:rPr>
+              <w:t xml:space="preserve">SportSeek sponsor (decides), PO, Srivin lead</w:t>
+            </w:r>
+          </w:p>
+        </w:tc>
+        <w:tc>
+          <w:tcPr>
+            <w:tcW w:type="dxa" w:w="2322"/>
+            <w:tcBorders>
+              <w:top w:val="single" w:color="C9CED8" w:sz="4"/>
+              <w:left w:val="single" w:color="C9CED8" w:sz="4"/>
+              <w:bottom w:val="single" w:color="C9CED8" w:sz="4"/>
+              <w:right w:val="single" w:color="C9CED8" w:sz="4"/>
+            </w:tcBorders>
+            <w:shd w:fill="F3F5F9" w:color="auto" w:val="clear"/>
+            <w:tcMar>
+              <w:top w:type="dxa" w:w="60"/>
+              <w:left w:type="dxa" w:w="90"/>
+              <w:bottom w:type="dxa" w:w="60"/>
+              <w:right w:type="dxa" w:w="90"/>
+            </w:tcMar>
+            <w:vAlign w:val="top"/>
+          </w:tcPr>
+          <w:p>
+            <w:pPr>
+              <w:spacing w:after="20" w:line="250"/>
+            </w:pPr>
+            <w:r>
+              <w:rPr>
+                <w:rFonts w:ascii="Arial" w:cs="Arial" w:eastAsia="Arial" w:hAnsi="Arial"/>
+                <w:color w:val="1A1A1A"/>
+                <w:sz w:val="18"/>
+                <w:szCs w:val="18"/>
+              </w:rPr>
+              <w:t xml:space="preserve">Signed Go/No-Go record</w:t>
+            </w:r>
+          </w:p>
+        </w:tc>
+      </w:tr>
+      <w:tr>
+        <w:trPr>
+          <w:cantSplit/>
+        </w:trPr>
+        <w:tc>
+          <w:tcPr>
+            <w:tcW w:type="dxa" w:w="1427"/>
+            <w:tcBorders>
+              <w:top w:val="single" w:color="C9CED8" w:sz="4"/>
+              <w:left w:val="single" w:color="C9CED8" w:sz="4"/>
+              <w:bottom w:val="single" w:color="C9CED8" w:sz="4"/>
+              <w:right w:val="single" w:color="C9CED8" w:sz="4"/>
+            </w:tcBorders>
+            <w:tcMar>
+              <w:top w:type="dxa" w:w="60"/>
+              <w:left w:type="dxa" w:w="90"/>
+              <w:bottom w:type="dxa" w:w="60"/>
+              <w:right w:type="dxa" w:w="90"/>
+            </w:tcMar>
+            <w:vAlign w:val="top"/>
+          </w:tcPr>
+          <w:p>
+            <w:pPr>
+              <w:spacing w:after="20" w:line="250"/>
+            </w:pPr>
+            <w:r>
+              <w:rPr>
+                <w:rFonts w:ascii="Arial" w:cs="Arial" w:eastAsia="Arial" w:hAnsi="Arial"/>
+                <w:color w:val="1A1A1A"/>
+                <w:sz w:val="18"/>
+                <w:szCs w:val="18"/>
+              </w:rPr>
               <w:t xml:space="preserve">20 Oct</w:t>
             </w:r>
           </w:p>
@@ -5279,7 +5399,6 @@
               <w:bottom w:val="single" w:color="C9CED8" w:sz="4"/>
               <w:right w:val="single" w:color="C9CED8" w:sz="4"/>
             </w:tcBorders>
-            <w:shd w:fill="F3F5F9" w:color="auto" w:val="clear"/>
             <w:tcMar>
               <w:top w:type="dxa" w:w="60"/>
               <w:left w:type="dxa" w:w="90"/>
@@ -5312,7 +5431,6 @@
               <w:bottom w:val="single" w:color="C9CED8" w:sz="4"/>
               <w:right w:val="single" w:color="C9CED8" w:sz="4"/>
             </w:tcBorders>
-            <w:shd w:fill="F3F5F9" w:color="auto" w:val="clear"/>
             <w:tcMar>
               <w:top w:type="dxa" w:w="60"/>
               <w:left w:type="dxa" w:w="90"/>
@@ -5345,7 +5463,6 @@
               <w:bottom w:val="single" w:color="C9CED8" w:sz="4"/>
               <w:right w:val="single" w:color="C9CED8" w:sz="4"/>
             </w:tcBorders>
-            <w:shd w:fill="F3F5F9" w:color="auto" w:val="clear"/>
             <w:tcMar>
               <w:top w:type="dxa" w:w="60"/>
               <w:left w:type="dxa" w:w="90"/>
@@ -5416,7 +5533,7 @@
           <w:rFonts w:ascii="Arial" w:cs="Arial" w:eastAsia="Arial" w:hAnsi="Arial"/>
           <w:color w:val="1A1A1A"/>
         </w:rPr>
-        <w:t xml:space="preserve">VAPT of the launch surface with no open critical/high findings (SOW §6.2).</w:t>
+        <w:t xml:space="preserve">VAPT of the launch surface and targeted identity pen test with no open critical/high findings (SOW §6.2).</w:t>
       </w:r>
     </w:p>
     <w:p>
@@ -5433,7 +5550,7 @@
           <w:rFonts w:ascii="Arial" w:cs="Arial" w:eastAsia="Arial" w:hAnsi="Arial"/>
           <w:color w:val="1A1A1A"/>
         </w:rPr>
-        <w:t xml:space="preserve">Load test passed at SportSeek's launch concurrency (D5).</w:t>
+        <w:t xml:space="preserve">Load test passed at SportSeek's launch concurrency (D5), including login and OTP flows.</w:t>
       </w:r>
     </w:p>
     <w:p>
@@ -5484,7 +5601,24 @@
           <w:rFonts w:ascii="Arial" w:cs="Arial" w:eastAsia="Arial" w:hAnsi="Arial"/>
           <w:color w:val="1A1A1A"/>
         </w:rPr>
-        <w:t xml:space="preserve">UAT sign-off by SportSeek testers. F1/F2 are included only if they meet the same bar; otherwise they follow within two weeks.</w:t>
+        <w:t xml:space="preserve">UAT sign-off by SportSeek testers, including account-linking scenarios.</w:t>
+      </w:r>
+    </w:p>
+    <w:p>
+      <w:pPr>
+        <w:pStyle w:val="ListParagraph"/>
+        <w:numPr>
+          <w:ilvl w:val="0"/>
+          <w:numId w:val="3"/>
+        </w:numPr>
+        <w:spacing w:after="60" w:line="264"/>
+      </w:pPr>
+      <w:r>
+        <w:rPr>
+          <w:rFonts w:ascii="Arial" w:cs="Arial" w:eastAsia="Arial" w:hAnsi="Arial"/>
+          <w:color w:val="1A1A1A"/>
+        </w:rPr>
+        <w:t xml:space="preserve">F3 is switched on only if it meets all of the above. Otherwise SportSeek launches on the Phase 1 login and F3 follows in a fast-follow.</w:t>
       </w:r>
     </w:p>
     <w:p>
@@ -6708,7 +6842,7 @@
                 <w:sz w:val="18"/>
                 <w:szCs w:val="18"/>
               </w:rPr>
-              <w:t xml:space="preserve">Train goal: the two features, with acceptance criteria</w:t>
+              <w:t xml:space="preserve">Train goal: the release's features, with acceptance criteria</w:t>
             </w:r>
           </w:p>
         </w:tc>
@@ -7723,7 +7857,7 @@
           <w:rFonts w:ascii="Arial" w:cs="Arial" w:eastAsia="Arial" w:hAnsi="Arial"/>
           <w:color w:val="1A1A1A"/>
         </w:rPr>
-        <w:t xml:space="preserve">One cross-functional pod of about 10–11 people, all senior enough to judge AI output. Total planned effort is 67.25 person-months, against 154 in our conventional estimate for the same scope. Roles, skills and monthly loading are in the WBS &amp; Integrated Project Plan, Section 14.</w:t>
+        <w:t xml:space="preserve">One cross-functional pod of about 10–11 people (about 14 in launch month, with extra identity capacity), all senior enough to judge AI output. Total planned effort is 69.5 person-months, against 154 in our conventional estimate for the same scope. Roles, skills and monthly loading are in the WBS &amp; Integrated Project Plan, Section 14.</w:t>
       </w:r>
     </w:p>
     <w:tbl>
@@ -8442,7 +8576,7 @@
                 <w:sz w:val="18"/>
                 <w:szCs w:val="18"/>
               </w:rPr>
-              <w:t xml:space="preserve">Targeted pen tests (R2, R3, R6) and full VAPT (R6); load tests (R1, R5, R6).</w:t>
+              <w:t xml:space="preserve">Targeted pen tests (R1 identity, R3 refunds, R6 payouts) and full VAPT (R6); load tests (R1, R5, R6).</w:t>
             </w:r>
           </w:p>
         </w:tc>
@@ -14866,7 +15000,7 @@
                 <w:sz w:val="17"/>
                 <w:szCs w:val="17"/>
               </w:rPr>
-              <w:t xml:space="preserve">CI + R1, R2, R3, R6</w:t>
+              <w:t xml:space="preserve">CI + R1 (incl. identity), R3, R6</w:t>
             </w:r>
           </w:p>
         </w:tc>
@@ -15801,7 +15935,7 @@
           <w:rFonts w:ascii="Arial" w:cs="Arial" w:eastAsia="Arial" w:hAnsi="Arial"/>
           <w:color w:val="1A1A1A"/>
         </w:rPr>
-        <w:t xml:space="preserve"> on the apps, so API changes (e.g. identity in R2) never strand old clients.</w:t>
+        <w:t xml:space="preserve"> on the apps, so API changes (e.g. identity in R1) never strand old clients.</w:t>
       </w:r>
     </w:p>
     <w:p>
@@ -17057,7 +17191,7 @@
                 <w:sz w:val="17"/>
                 <w:szCs w:val="17"/>
               </w:rPr>
-              <w:t xml:space="preserve">AI-assisted assessment in 3 days; Scope Gate; F1/F2 de-scoped before launch is risked</w:t>
+              <w:t xml:space="preserve">AI-assisted assessment in 3 days; Scope Gate; hardening prioritised over F3</w:t>
             </w:r>
           </w:p>
         </w:tc>
@@ -17127,7 +17261,7 @@
                 <w:sz w:val="17"/>
                 <w:szCs w:val="17"/>
               </w:rPr>
-              <w:t xml:space="preserve">R3</w:t>
+              <w:t xml:space="preserve">R2a</w:t>
             </w:r>
           </w:p>
         </w:tc>
@@ -17159,7 +17293,7 @@
                 <w:sz w:val="17"/>
                 <w:szCs w:val="17"/>
               </w:rPr>
-              <w:t xml:space="preserve">SportSeek decision/approval pace lags the monthly train</w:t>
+              <w:t xml:space="preserve">F3 Shared Identity not ready or not clean by 19 Oct (7 working days of build)</w:t>
             </w:r>
           </w:p>
         </w:tc>
@@ -17191,7 +17325,7 @@
                 <w:sz w:val="17"/>
                 <w:szCs w:val="17"/>
               </w:rPr>
-              <w:t xml:space="preserve">M / H</w:t>
+              <w:t xml:space="preserve">H / H</w:t>
             </w:r>
           </w:p>
         </w:tc>
@@ -17223,7 +17357,7 @@
                 <w:sz w:val="17"/>
                 <w:szCs w:val="17"/>
               </w:rPr>
-              <w:t xml:space="preserve">1-day decision and 2-day UI approval agreement; weekly decision log; affected feature moves, not the release</w:t>
+              <w:t xml:space="preserve">Tight F3 scope; identity decisions by 2 Oct; +2 engineers in October; identity pen test; remote switch with fallback to Phase 1 login</w:t>
             </w:r>
           </w:p>
         </w:tc>
@@ -17255,7 +17389,7 @@
                 <w:sz w:val="17"/>
                 <w:szCs w:val="17"/>
               </w:rPr>
-              <w:t xml:space="preserve">SportSeek PO</w:t>
+              <w:t xml:space="preserve">Architect</w:t>
             </w:r>
           </w:p>
         </w:tc>
@@ -17293,7 +17427,7 @@
                 <w:sz w:val="17"/>
                 <w:szCs w:val="17"/>
               </w:rPr>
-              <w:t xml:space="preserve">R4</w:t>
+              <w:t xml:space="preserve">R3</w:t>
             </w:r>
           </w:p>
         </w:tc>
@@ -17326,7 +17460,7 @@
                 <w:sz w:val="17"/>
                 <w:szCs w:val="17"/>
               </w:rPr>
-              <w:t xml:space="preserve">Quality or security issues in AI-generated code</w:t>
+              <w:t xml:space="preserve">SportSeek decision/approval pace lags the monthly train</w:t>
             </w:r>
           </w:p>
         </w:tc>
@@ -17359,7 +17493,7 @@
                 <w:sz w:val="17"/>
                 <w:szCs w:val="17"/>
               </w:rPr>
-              <w:t xml:space="preserve">L-M / H</w:t>
+              <w:t xml:space="preserve">M / H</w:t>
             </w:r>
           </w:p>
         </w:tc>
@@ -17392,7 +17526,7 @@
                 <w:sz w:val="17"/>
                 <w:szCs w:val="17"/>
               </w:rPr>
-              <w:t xml:space="preserve">Human review, dual review on sensitive code, full gates, targeted pen tests</w:t>
+              <w:t xml:space="preserve">1-day decision and 2-day UI approval agreement; weekly decision log; affected feature moves, not the release</w:t>
             </w:r>
           </w:p>
         </w:tc>
@@ -17425,7 +17559,7 @@
                 <w:sz w:val="17"/>
                 <w:szCs w:val="17"/>
               </w:rPr>
-              <w:t xml:space="preserve">Architect</w:t>
+              <w:t xml:space="preserve">SportSeek PO</w:t>
             </w:r>
           </w:p>
         </w:tc>
@@ -17462,7 +17596,7 @@
                 <w:sz w:val="17"/>
                 <w:szCs w:val="17"/>
               </w:rPr>
-              <w:t xml:space="preserve">R5</w:t>
+              <w:t xml:space="preserve">R4</w:t>
             </w:r>
           </w:p>
         </w:tc>
@@ -17494,7 +17628,7 @@
                 <w:sz w:val="17"/>
                 <w:szCs w:val="17"/>
               </w:rPr>
-              <w:t xml:space="preserve">Over-reliance on AI erodes team understanding</w:t>
+              <w:t xml:space="preserve">Quality or security issues in AI-generated code</w:t>
             </w:r>
           </w:p>
         </w:tc>
@@ -17526,7 +17660,7 @@
                 <w:sz w:val="17"/>
                 <w:szCs w:val="17"/>
               </w:rPr>
-              <w:t xml:space="preserve">L / M</w:t>
+              <w:t xml:space="preserve">L-M / H</w:t>
             </w:r>
           </w:p>
         </w:tc>
@@ -17558,7 +17692,7 @@
                 <w:sz w:val="17"/>
                 <w:szCs w:val="17"/>
               </w:rPr>
-              <w:t xml:space="preserve">Engineers must explain every merge; SportSeek developers in the pod; living docs</w:t>
+              <w:t xml:space="preserve">Human review, dual review on sensitive code, full gates, targeted pen tests</w:t>
             </w:r>
           </w:p>
         </w:tc>
@@ -17628,7 +17762,7 @@
                 <w:sz w:val="17"/>
                 <w:szCs w:val="17"/>
               </w:rPr>
-              <w:t xml:space="preserve">R6</w:t>
+              <w:t xml:space="preserve">R5</w:t>
             </w:r>
           </w:p>
         </w:tc>
@@ -17661,7 +17795,7 @@
                 <w:sz w:val="17"/>
                 <w:szCs w:val="17"/>
               </w:rPr>
-              <w:t xml:space="preserve">Third-party approvals (Route, DLT, WhatsApp)</w:t>
+              <w:t xml:space="preserve">Over-reliance on AI erodes team understanding</w:t>
             </w:r>
           </w:p>
         </w:tc>
@@ -17694,7 +17828,7 @@
                 <w:sz w:val="17"/>
                 <w:szCs w:val="17"/>
               </w:rPr>
-              <w:t xml:space="preserve">M / M</w:t>
+              <w:t xml:space="preserve">L / M</w:t>
             </w:r>
           </w:p>
         </w:tc>
@@ -17727,7 +17861,7 @@
                 <w:sz w:val="17"/>
                 <w:szCs w:val="17"/>
               </w:rPr>
-              <w:t xml:space="preserve">Need-by dates months ahead; those features in the last train</w:t>
+              <w:t xml:space="preserve">Engineers must explain every merge; SportSeek developers in the pod; living docs</w:t>
             </w:r>
           </w:p>
         </w:tc>
@@ -17760,7 +17894,7 @@
                 <w:sz w:val="17"/>
                 <w:szCs w:val="17"/>
               </w:rPr>
-              <w:t xml:space="preserve">SportSeek</w:t>
+              <w:t xml:space="preserve">Architect</w:t>
             </w:r>
           </w:p>
         </w:tc>
@@ -17797,7 +17931,7 @@
                 <w:sz w:val="17"/>
                 <w:szCs w:val="17"/>
               </w:rPr>
-              <w:t xml:space="preserve">R7</w:t>
+              <w:t xml:space="preserve">R6</w:t>
             </w:r>
           </w:p>
         </w:tc>
@@ -17829,7 +17963,7 @@
                 <w:sz w:val="17"/>
                 <w:szCs w:val="17"/>
               </w:rPr>
-              <w:t xml:space="preserve">Duplicate identities in existing data</w:t>
+              <w:t xml:space="preserve">Third-party approvals (Route, DLT, WhatsApp)</w:t>
             </w:r>
           </w:p>
         </w:tc>
@@ -17893,7 +18027,7 @@
                 <w:sz w:val="17"/>
                 <w:szCs w:val="17"/>
               </w:rPr>
-              <w:t xml:space="preserve">Early duplicate report; approved merge rules; rehearsed migration</w:t>
+              <w:t xml:space="preserve">Need-by dates months ahead; those features in the last train</w:t>
             </w:r>
           </w:p>
         </w:tc>
@@ -17925,7 +18059,7 @@
                 <w:sz w:val="17"/>
                 <w:szCs w:val="17"/>
               </w:rPr>
-              <w:t xml:space="preserve">Architect</w:t>
+              <w:t xml:space="preserve">SportSeek</w:t>
             </w:r>
           </w:p>
         </w:tc>
@@ -17963,7 +18097,7 @@
                 <w:sz w:val="17"/>
                 <w:szCs w:val="17"/>
               </w:rPr>
-              <w:t xml:space="preserve">R8</w:t>
+              <w:t xml:space="preserve">R7</w:t>
             </w:r>
           </w:p>
         </w:tc>
@@ -17996,7 +18130,7 @@
                 <w:sz w:val="17"/>
                 <w:szCs w:val="17"/>
               </w:rPr>
-              <w:t xml:space="preserve">App-store review delays a mobile release</w:t>
+              <w:t xml:space="preserve">Duplicate identities in existing data</w:t>
             </w:r>
           </w:p>
         </w:tc>
@@ -18029,7 +18163,7 @@
                 <w:sz w:val="17"/>
                 <w:szCs w:val="17"/>
               </w:rPr>
-              <w:t xml:space="preserve">L-M / M</w:t>
+              <w:t xml:space="preserve">M / M</w:t>
             </w:r>
           </w:p>
         </w:tc>
@@ -18062,6 +18196,172 @@
                 <w:sz w:val="17"/>
                 <w:szCs w:val="17"/>
               </w:rPr>
+              <w:t xml:space="preserve">Early duplicate report; approved merge rules; rehearsed migration</w:t>
+            </w:r>
+          </w:p>
+        </w:tc>
+        <w:tc>
+          <w:tcPr>
+            <w:tcW w:type="dxa" w:w="956"/>
+            <w:tcBorders>
+              <w:top w:val="single" w:color="C9CED8" w:sz="4"/>
+              <w:left w:val="single" w:color="C9CED8" w:sz="4"/>
+              <w:bottom w:val="single" w:color="C9CED8" w:sz="4"/>
+              <w:right w:val="single" w:color="C9CED8" w:sz="4"/>
+            </w:tcBorders>
+            <w:shd w:fill="F3F5F9" w:color="auto" w:val="clear"/>
+            <w:tcMar>
+              <w:top w:type="dxa" w:w="60"/>
+              <w:left w:type="dxa" w:w="90"/>
+              <w:bottom w:type="dxa" w:w="60"/>
+              <w:right w:type="dxa" w:w="90"/>
+            </w:tcMar>
+            <w:vAlign w:val="top"/>
+          </w:tcPr>
+          <w:p>
+            <w:pPr>
+              <w:spacing w:after="20" w:line="250"/>
+            </w:pPr>
+            <w:r>
+              <w:rPr>
+                <w:rFonts w:ascii="Arial" w:cs="Arial" w:eastAsia="Arial" w:hAnsi="Arial"/>
+                <w:color w:val="1A1A1A"/>
+                <w:sz w:val="17"/>
+                <w:szCs w:val="17"/>
+              </w:rPr>
+              <w:t xml:space="preserve">Architect</w:t>
+            </w:r>
+          </w:p>
+        </w:tc>
+      </w:tr>
+      <w:tr>
+        <w:trPr>
+          <w:cantSplit/>
+        </w:trPr>
+        <w:tc>
+          <w:tcPr>
+            <w:tcW w:type="dxa" w:w="477"/>
+            <w:tcBorders>
+              <w:top w:val="single" w:color="C9CED8" w:sz="4"/>
+              <w:left w:val="single" w:color="C9CED8" w:sz="4"/>
+              <w:bottom w:val="single" w:color="C9CED8" w:sz="4"/>
+              <w:right w:val="single" w:color="C9CED8" w:sz="4"/>
+            </w:tcBorders>
+            <w:tcMar>
+              <w:top w:type="dxa" w:w="60"/>
+              <w:left w:type="dxa" w:w="90"/>
+              <w:bottom w:type="dxa" w:w="60"/>
+              <w:right w:type="dxa" w:w="90"/>
+            </w:tcMar>
+            <w:vAlign w:val="top"/>
+          </w:tcPr>
+          <w:p>
+            <w:pPr>
+              <w:spacing w:after="20" w:line="250"/>
+            </w:pPr>
+            <w:r>
+              <w:rPr>
+                <w:rFonts w:ascii="Arial" w:cs="Arial" w:eastAsia="Arial" w:hAnsi="Arial"/>
+                <w:color w:val="1A1A1A"/>
+                <w:sz w:val="17"/>
+                <w:szCs w:val="17"/>
+              </w:rPr>
+              <w:t xml:space="preserve">R8</w:t>
+            </w:r>
+          </w:p>
+        </w:tc>
+        <w:tc>
+          <w:tcPr>
+            <w:tcW w:type="dxa" w:w="3244"/>
+            <w:tcBorders>
+              <w:top w:val="single" w:color="C9CED8" w:sz="4"/>
+              <w:left w:val="single" w:color="C9CED8" w:sz="4"/>
+              <w:bottom w:val="single" w:color="C9CED8" w:sz="4"/>
+              <w:right w:val="single" w:color="C9CED8" w:sz="4"/>
+            </w:tcBorders>
+            <w:tcMar>
+              <w:top w:type="dxa" w:w="60"/>
+              <w:left w:type="dxa" w:w="90"/>
+              <w:bottom w:type="dxa" w:w="60"/>
+              <w:right w:type="dxa" w:w="90"/>
+            </w:tcMar>
+            <w:vAlign w:val="top"/>
+          </w:tcPr>
+          <w:p>
+            <w:pPr>
+              <w:spacing w:after="20" w:line="250"/>
+            </w:pPr>
+            <w:r>
+              <w:rPr>
+                <w:rFonts w:ascii="Arial" w:cs="Arial" w:eastAsia="Arial" w:hAnsi="Arial"/>
+                <w:color w:val="1A1A1A"/>
+                <w:sz w:val="17"/>
+                <w:szCs w:val="17"/>
+              </w:rPr>
+              <w:t xml:space="preserve">App-store review delays a mobile release</w:t>
+            </w:r>
+          </w:p>
+        </w:tc>
+        <w:tc>
+          <w:tcPr>
+            <w:tcW w:type="dxa" w:w="858"/>
+            <w:tcBorders>
+              <w:top w:val="single" w:color="C9CED8" w:sz="4"/>
+              <w:left w:val="single" w:color="C9CED8" w:sz="4"/>
+              <w:bottom w:val="single" w:color="C9CED8" w:sz="4"/>
+              <w:right w:val="single" w:color="C9CED8" w:sz="4"/>
+            </w:tcBorders>
+            <w:tcMar>
+              <w:top w:type="dxa" w:w="60"/>
+              <w:left w:type="dxa" w:w="90"/>
+              <w:bottom w:type="dxa" w:w="60"/>
+              <w:right w:type="dxa" w:w="90"/>
+            </w:tcMar>
+            <w:vAlign w:val="top"/>
+          </w:tcPr>
+          <w:p>
+            <w:pPr>
+              <w:spacing w:after="20" w:line="250"/>
+            </w:pPr>
+            <w:r>
+              <w:rPr>
+                <w:rFonts w:ascii="Arial" w:cs="Arial" w:eastAsia="Arial" w:hAnsi="Arial"/>
+                <w:color w:val="1A1A1A"/>
+                <w:sz w:val="17"/>
+                <w:szCs w:val="17"/>
+              </w:rPr>
+              <w:t xml:space="preserve">L-M / M</w:t>
+            </w:r>
+          </w:p>
+        </w:tc>
+        <w:tc>
+          <w:tcPr>
+            <w:tcW w:type="dxa" w:w="4103"/>
+            <w:tcBorders>
+              <w:top w:val="single" w:color="C9CED8" w:sz="4"/>
+              <w:left w:val="single" w:color="C9CED8" w:sz="4"/>
+              <w:bottom w:val="single" w:color="C9CED8" w:sz="4"/>
+              <w:right w:val="single" w:color="C9CED8" w:sz="4"/>
+            </w:tcBorders>
+            <w:tcMar>
+              <w:top w:type="dxa" w:w="60"/>
+              <w:left w:type="dxa" w:w="90"/>
+              <w:bottom w:type="dxa" w:w="60"/>
+              <w:right w:type="dxa" w:w="90"/>
+            </w:tcMar>
+            <w:vAlign w:val="top"/>
+          </w:tcPr>
+          <w:p>
+            <w:pPr>
+              <w:spacing w:after="20" w:line="250"/>
+            </w:pPr>
+            <w:r>
+              <w:rPr>
+                <w:rFonts w:ascii="Arial" w:cs="Arial" w:eastAsia="Arial" w:hAnsi="Arial"/>
+                <w:color w:val="1A1A1A"/>
+                <w:sz w:val="17"/>
+                <w:szCs w:val="17"/>
+              </w:rPr>
               <w:t xml:space="preserve">Submission in week 4; web and back end unaffected; features stay behind flags</w:t>
             </w:r>
           </w:p>
@@ -18075,7 +18375,6 @@
               <w:bottom w:val="single" w:color="C9CED8" w:sz="4"/>
               <w:right w:val="single" w:color="C9CED8" w:sz="4"/>
             </w:tcBorders>
-            <w:shd w:fill="F3F5F9" w:color="auto" w:val="clear"/>
             <w:tcMar>
               <w:top w:type="dxa" w:w="60"/>
               <w:left w:type="dxa" w:w="90"/>
@@ -20651,7 +20950,7 @@
           <w:rFonts w:ascii="Arial" w:cs="Arial" w:eastAsia="Arial" w:hAnsi="Arial"/>
           <w:color w:val="1A1A1A"/>
         </w:rPr>
-        <w:t xml:space="preserve">: a fixed fee for each monthly release (two features), invoiced on UAT sign-off. SportSeek pays for delivered, accepted features and can approve costs one release at a time, as the SOW Next Steps ask.</w:t>
+        <w:t xml:space="preserve">: a fixed fee for each monthly release, sized to its features, invoiced on UAT sign-off. SportSeek pays for delivered, accepted features and can approve costs one release at a time, as the SOW Next Steps ask.</w:t>
       </w:r>
     </w:p>
     <w:p>
@@ -20748,14 +21047,14 @@
           <w:bCs/>
           <w:color w:val="1A1A1A"/>
         </w:rPr>
-        <w:t xml:space="preserve">Public on 20 Oct 2026</w:t>
+        <w:t xml:space="preserve">Public on 20 Oct 2026 with Shared Identity live</w:t>
       </w:r>
       <w:r>
         <w:rPr>
           <w:rFonts w:ascii="Arial" w:cs="Arial" w:eastAsia="Arial" w:hAnsi="Arial"/>
           <w:color w:val="1A1A1A"/>
         </w:rPr>
-        <w:t xml:space="preserve">, with two new features on day one.</w:t>
+        <w:t xml:space="preserve">, with a safe fallback to the Phase 1 login.</w:t>
       </w:r>
     </w:p>
     <w:p>
@@ -20774,14 +21073,14 @@
           <w:bCs/>
           <w:color w:val="1A1A1A"/>
         </w:rPr>
-        <w:t xml:space="preserve">Two features in production every month</w:t>
+        <w:t xml:space="preserve">New features in production every month</w:t>
       </w:r>
       <w:r>
         <w:rPr>
           <w:rFonts w:ascii="Arial" w:cs="Arial" w:eastAsia="Arial" w:hAnsi="Arial"/>
           <w:color w:val="1A1A1A"/>
         </w:rPr>
-        <w:t xml:space="preserve">, on fixed release dates, to Phase 2A completion on </w:t>
+        <w:t xml:space="preserve"> (12 features in 6 releases), on fixed release dates, to Phase 2A completion on </w:t>
       </w:r>
       <w:r>
         <w:rPr>
@@ -20823,7 +21122,7 @@
           <w:rFonts w:ascii="Arial" w:cs="Arial" w:eastAsia="Arial" w:hAnsi="Arial"/>
           <w:color w:val="1A1A1A"/>
         </w:rPr>
-        <w:t xml:space="preserve"> (67.25 person-months, less than half the conventional estimate), with every AI output reviewed and owned by a named engineer.</w:t>
+        <w:t xml:space="preserve"> (69.5 person-months, less than half the conventional estimate), with every AI output reviewed and owned by a named engineer.</w:t>
       </w:r>
     </w:p>
     <w:p>

</xml_diff>